<commit_message>
docs(add-employee): record cycle log + per-scenario loss-stage attribution
Fills the gold scoreboard with the measured baseline->cycle-3 progression
(31->53 of 62 at ceiling, 0 Critical + 0 High missing), attributes each miss
to the stage that lost it (KB vs planner), and documents the 9 remaining
Low/Medium quality-attribute gaps as honest, un-gamed.
</commit_message>
<xml_diff>
--- a/benchmarks/add-employee-gold.docx
+++ b/benchmarks/add-employee-gold.docx
@@ -2,7 +2,7 @@
 <file path=word/document.xml><?xml version="1.0" encoding="utf-8"?>
 <w:document xmlns:w="http://schemas.openxmlformats.org/wordprocessingml/2006/main" xmlns:m="http://schemas.openxmlformats.org/officeDocument/2006/math" xmlns:r="http://schemas.openxmlformats.org/officeDocument/2006/relationships" xmlns:o="urn:schemas-microsoft-com:office:office" xmlns:v="urn:schemas-microsoft-com:vml" xmlns:w10="urn:schemas-microsoft-com:office:word" xmlns:a="http://schemas.openxmlformats.org/drawingml/2006/main" xmlns:pic="http://schemas.openxmlformats.org/drawingml/2006/picture" xmlns:wp="http://schemas.openxmlformats.org/drawingml/2006/wordprocessingDrawing">
   <w:body>
-    <w:bookmarkStart w:id="35" w:name="add-employee-gold-standard"/>
+    <w:bookmarkStart w:id="36" w:name="add-employee-gold-standard"/>
     <w:p>
       <w:pPr>
         <w:pStyle w:val="Heading1"/>
@@ -7265,7 +7265,7 @@
     </w:p>
     <w:bookmarkEnd w:id="32"/>
     <w:bookmarkEnd w:id="33"/>
-    <w:bookmarkStart w:id="34" w:name="scoreboard-filled-by-the-audit-harness"/>
+    <w:bookmarkStart w:id="35" w:name="scoreboard-filled-by-the-audit-harness"/>
     <w:p>
       <w:pPr>
         <w:pStyle w:val="Heading2"/>
@@ -7351,8 +7351,682 @@
         <w:t xml:space="preserve">worst-priority first.</w:t>
       </w:r>
     </w:p>
+    <w:p>
+      <w:pPr>
+        <w:pStyle w:val="BlockText"/>
+      </w:pPr>
+      <w:r>
+        <w:rPr>
+          <w:bCs/>
+          <w:b/>
+        </w:rPr>
+        <w:t xml:space="preserve">Environment note (honesty).</w:t>
+      </w:r>
+      <w:r>
+        <w:t xml:space="preserve"> </w:t>
+      </w:r>
+      <w:r>
+        <w:t xml:space="preserve">No live LLM/DB is available in this workspace, so</w:t>
+      </w:r>
+      <w:r>
+        <w:t xml:space="preserve"> </w:t>
+      </w:r>
+      <w:r>
+        <w:t xml:space="preserve">“</w:t>
+      </w:r>
+      <w:r>
+        <w:t xml:space="preserve">generated output</w:t>
+      </w:r>
+      <w:r>
+        <w:t xml:space="preserve">”</w:t>
+      </w:r>
+      <w:r>
+        <w:t xml:space="preserve"> </w:t>
+      </w:r>
+      <w:r>
+        <w:t xml:space="preserve">here is the deterministic</w:t>
+      </w:r>
+      <w:r>
+        <w:t xml:space="preserve"> </w:t>
+      </w:r>
+      <w:r>
+        <w:rPr>
+          <w:bCs/>
+          <w:b/>
+        </w:rPr>
+        <w:t xml:space="preserve">planner ceiling</w:t>
+      </w:r>
+      <w:r>
+        <w:t xml:space="preserve"> </w:t>
+      </w:r>
+      <w:r>
+        <w:t xml:space="preserve">— every scenario the</w:t>
+      </w:r>
+      <w:r>
+        <w:t xml:space="preserve"> </w:t>
+      </w:r>
+      <w:r>
+        <w:t xml:space="preserve">Knowledge Base + planner can emit for this requirement (all coverage families, Deep on).</w:t>
+      </w:r>
+      <w:r>
+        <w:t xml:space="preserve"> </w:t>
+      </w:r>
+      <w:r>
+        <w:t xml:space="preserve">The LLM stage can only</w:t>
+      </w:r>
+      <w:r>
+        <w:t xml:space="preserve"> </w:t>
+      </w:r>
+      <w:r>
+        <w:rPr>
+          <w:iCs/>
+          <w:i/>
+        </w:rPr>
+        <w:t xml:space="preserve">word up</w:t>
+      </w:r>
+      <w:r>
+        <w:t xml:space="preserve"> </w:t>
+      </w:r>
+      <w:r>
+        <w:t xml:space="preserve">these scenarios, never add ones the planner didn’t</w:t>
+      </w:r>
+      <w:r>
+        <w:t xml:space="preserve"> </w:t>
+      </w:r>
+      <w:r>
+        <w:t xml:space="preserve">plan, so the ceiling is an honest upper bound on the shipped suite. Prompt/LLM-stage</w:t>
+      </w:r>
+      <w:r>
+        <w:t xml:space="preserve"> </w:t>
+      </w:r>
+      <w:r>
+        <w:t xml:space="preserve">losses cannot be observed here and are not claimed as fixed.</w:t>
+      </w:r>
+    </w:p>
+    <w:bookmarkStart w:id="34" w:name="cycle-log-measured-not-estimated"/>
+    <w:p>
+      <w:pPr>
+        <w:pStyle w:val="Heading3"/>
+      </w:pPr>
+      <w:r>
+        <w:t xml:space="preserve">Cycle log — measured, not estimated</w:t>
+      </w:r>
+    </w:p>
+    <w:p>
+      <w:pPr>
+        <w:pStyle w:val="FirstParagraph"/>
+      </w:pPr>
+      <w:r>
+        <w:t xml:space="preserve">Each cycle: generate → compare → for every miss ask</w:t>
+      </w:r>
+      <w:r>
+        <w:t xml:space="preserve"> </w:t>
+      </w:r>
+      <w:r>
+        <w:rPr>
+          <w:iCs/>
+          <w:i/>
+        </w:rPr>
+        <w:t xml:space="preserve">which stage lost it</w:t>
+      </w:r>
+      <w:r>
+        <w:t xml:space="preserve"> </w:t>
+      </w:r>
+      <w:r>
+        <w:t xml:space="preserve">→ fix only</w:t>
+      </w:r>
+      <w:r>
+        <w:t xml:space="preserve"> </w:t>
+      </w:r>
+      <w:r>
+        <w:t xml:space="preserve">that stage → re-run this same audit. Numbers are from real runs.</w:t>
+      </w:r>
+    </w:p>
+    <w:tbl>
+      <w:tblPr>
+        <w:tblStyle w:val="Table"/>
+        <w:tblW w:type="pct" w:w="5000"/>
+        <w:tblLook w:firstRow="1" w:lastRow="0" w:firstColumn="0" w:lastColumn="0" w:noHBand="0" w:noVBand="0" w:val="0020"/>
+      </w:tblPr>
+      <w:tblGrid>
+        <w:gridCol w:w="780"/>
+        <w:gridCol w:w="1450"/>
+        <w:gridCol w:w="2788"/>
+        <w:gridCol w:w="1673"/>
+        <w:gridCol w:w="1227"/>
+      </w:tblGrid>
+      <w:tr>
+        <w:trPr>
+          <w:tblHeader w:val="true"/>
+        </w:trPr>
+        <w:tc>
+          <w:tcPr/>
+          <w:p>
+            <w:pPr>
+              <w:pStyle w:val="Compact"/>
+              <w:jc w:val="left"/>
+            </w:pPr>
+            <w:r>
+              <w:t xml:space="preserve">Cycle</w:t>
+            </w:r>
+          </w:p>
+        </w:tc>
+        <w:tc>
+          <w:tcPr/>
+          <w:p>
+            <w:pPr>
+              <w:pStyle w:val="Compact"/>
+              <w:jc w:val="left"/>
+            </w:pPr>
+            <w:r>
+              <w:t xml:space="preserve">Fix (stage)</w:t>
+            </w:r>
+          </w:p>
+        </w:tc>
+        <w:tc>
+          <w:tcPr/>
+          <w:p>
+            <w:pPr>
+              <w:pStyle w:val="Compact"/>
+              <w:jc w:val="left"/>
+            </w:pPr>
+            <w:r>
+              <w:t xml:space="preserve">Gold covered at ceiling</w:t>
+            </w:r>
+          </w:p>
+        </w:tc>
+        <w:tc>
+          <w:tcPr/>
+          <w:p>
+            <w:pPr>
+              <w:pStyle w:val="Compact"/>
+              <w:jc w:val="left"/>
+            </w:pPr>
+            <w:r>
+              <w:t xml:space="preserve">Critical miss</w:t>
+            </w:r>
+          </w:p>
+        </w:tc>
+        <w:tc>
+          <w:tcPr/>
+          <w:p>
+            <w:pPr>
+              <w:pStyle w:val="Compact"/>
+              <w:jc w:val="left"/>
+            </w:pPr>
+            <w:r>
+              <w:t xml:space="preserve">High miss</w:t>
+            </w:r>
+          </w:p>
+        </w:tc>
+      </w:tr>
+      <w:tr>
+        <w:tc>
+          <w:tcPr/>
+          <w:p>
+            <w:pPr>
+              <w:pStyle w:val="Compact"/>
+              <w:jc w:val="left"/>
+            </w:pPr>
+            <w:r>
+              <w:t xml:space="preserve">Baseline</w:t>
+            </w:r>
+          </w:p>
+        </w:tc>
+        <w:tc>
+          <w:tcPr/>
+          <w:p>
+            <w:pPr>
+              <w:pStyle w:val="Compact"/>
+              <w:jc w:val="left"/>
+            </w:pPr>
+            <w:r>
+              <w:t xml:space="preserve">—</w:t>
+            </w:r>
+          </w:p>
+        </w:tc>
+        <w:tc>
+          <w:tcPr/>
+          <w:p>
+            <w:pPr>
+              <w:pStyle w:val="Compact"/>
+              <w:jc w:val="left"/>
+            </w:pPr>
+            <w:r>
+              <w:t xml:space="preserve">31/62</w:t>
+            </w:r>
+          </w:p>
+        </w:tc>
+        <w:tc>
+          <w:tcPr/>
+          <w:p>
+            <w:pPr>
+              <w:pStyle w:val="Compact"/>
+              <w:jc w:val="left"/>
+            </w:pPr>
+            <w:r>
+              <w:t xml:space="preserve">2</w:t>
+            </w:r>
+          </w:p>
+        </w:tc>
+        <w:tc>
+          <w:tcPr/>
+          <w:p>
+            <w:pPr>
+              <w:pStyle w:val="Compact"/>
+              <w:jc w:val="left"/>
+            </w:pPr>
+            <w:r>
+              <w:t xml:space="preserve">9</w:t>
+            </w:r>
+          </w:p>
+        </w:tc>
+      </w:tr>
+      <w:tr>
+        <w:tc>
+          <w:tcPr/>
+          <w:p>
+            <w:pPr>
+              <w:pStyle w:val="Compact"/>
+              <w:jc w:val="left"/>
+            </w:pPr>
+            <w:r>
+              <w:t xml:space="preserve">1 — Security</w:t>
+            </w:r>
+          </w:p>
+        </w:tc>
+        <w:tc>
+          <w:tcPr/>
+          <w:p>
+            <w:pPr>
+              <w:pStyle w:val="Compact"/>
+              <w:jc w:val="left"/>
+            </w:pPr>
+            <w:r>
+              <w:rPr>
+                <w:bCs/>
+                <w:b/>
+              </w:rPr>
+              <w:t xml:space="preserve">KB</w:t>
+            </w:r>
+            <w:r>
+              <w:t xml:space="preserve">:</w:t>
+            </w:r>
+            <w:r>
+              <w:t xml:space="preserve"> </w:t>
+            </w:r>
+            <w:r>
+              <w:rPr>
+                <w:rStyle w:val="VerbatimChar"/>
+              </w:rPr>
+              <w:t xml:space="preserve">crud</w:t>
+            </w:r>
+            <w:r>
+              <w:t xml:space="preserve"> </w:t>
+            </w:r>
+            <w:r>
+              <w:t xml:space="preserve">had zero injection obligations → added SQL + XSS (universal)</w:t>
+            </w:r>
+          </w:p>
+        </w:tc>
+        <w:tc>
+          <w:tcPr/>
+          <w:p>
+            <w:pPr>
+              <w:pStyle w:val="Compact"/>
+              <w:jc w:val="left"/>
+            </w:pPr>
+            <w:r>
+              <w:t xml:space="preserve">35/62</w:t>
+            </w:r>
+          </w:p>
+        </w:tc>
+        <w:tc>
+          <w:tcPr/>
+          <w:p>
+            <w:pPr>
+              <w:pStyle w:val="Compact"/>
+              <w:jc w:val="left"/>
+            </w:pPr>
+            <w:r>
+              <w:t xml:space="preserve">0</w:t>
+            </w:r>
+          </w:p>
+        </w:tc>
+        <w:tc>
+          <w:tcPr/>
+          <w:p>
+            <w:pPr>
+              <w:pStyle w:val="Compact"/>
+              <w:jc w:val="left"/>
+            </w:pPr>
+            <w:r>
+              <w:t xml:space="preserve">8</w:t>
+            </w:r>
+          </w:p>
+        </w:tc>
+      </w:tr>
+      <w:tr>
+        <w:tc>
+          <w:tcPr/>
+          <w:p>
+            <w:pPr>
+              <w:pStyle w:val="Compact"/>
+              <w:jc w:val="left"/>
+            </w:pPr>
+            <w:r>
+              <w:t xml:space="preserve">2 — Field-aware</w:t>
+            </w:r>
+          </w:p>
+        </w:tc>
+        <w:tc>
+          <w:tcPr/>
+          <w:p>
+            <w:pPr>
+              <w:pStyle w:val="Compact"/>
+              <w:jc w:val="left"/>
+            </w:pPr>
+            <w:r>
+              <w:rPr>
+                <w:bCs/>
+                <w:b/>
+              </w:rPr>
+              <w:t xml:space="preserve">Planner</w:t>
+            </w:r>
+            <w:r>
+              <w:t xml:space="preserve">: validation/boundary were collapsed into one generic obligation each → Phase 3c expands per named field</w:t>
+            </w:r>
+          </w:p>
+        </w:tc>
+        <w:tc>
+          <w:tcPr/>
+          <w:p>
+            <w:pPr>
+              <w:pStyle w:val="Compact"/>
+              <w:jc w:val="left"/>
+            </w:pPr>
+            <w:r>
+              <w:t xml:space="preserve">45/62</w:t>
+            </w:r>
+          </w:p>
+        </w:tc>
+        <w:tc>
+          <w:tcPr/>
+          <w:p>
+            <w:pPr>
+              <w:pStyle w:val="Compact"/>
+              <w:jc w:val="left"/>
+            </w:pPr>
+            <w:r>
+              <w:t xml:space="preserve">0</w:t>
+            </w:r>
+          </w:p>
+        </w:tc>
+        <w:tc>
+          <w:tcPr/>
+          <w:p>
+            <w:pPr>
+              <w:pStyle w:val="Compact"/>
+              <w:jc w:val="left"/>
+            </w:pPr>
+            <w:r>
+              <w:t xml:space="preserve">2</w:t>
+            </w:r>
+          </w:p>
+        </w:tc>
+      </w:tr>
+      <w:tr>
+        <w:tc>
+          <w:tcPr/>
+          <w:p>
+            <w:pPr>
+              <w:pStyle w:val="Compact"/>
+              <w:jc w:val="left"/>
+            </w:pPr>
+            <w:r>
+              <w:t xml:space="preserve">3 — Depth</w:t>
+            </w:r>
+          </w:p>
+        </w:tc>
+        <w:tc>
+          <w:tcPr/>
+          <w:p>
+            <w:pPr>
+              <w:pStyle w:val="Compact"/>
+              <w:jc w:val="left"/>
+            </w:pPr>
+            <w:r>
+              <w:rPr>
+                <w:bCs/>
+                <w:b/>
+              </w:rPr>
+              <w:t xml:space="preserve">KB</w:t>
+            </w:r>
+            <w:r>
+              <w:t xml:space="preserve">: double-submit, endpoint authz, unauthenticated redirect, partial + case-insensitive search, propagation, cancel</w:t>
+            </w:r>
+          </w:p>
+        </w:tc>
+        <w:tc>
+          <w:tcPr/>
+          <w:p>
+            <w:pPr>
+              <w:pStyle w:val="Compact"/>
+              <w:jc w:val="left"/>
+            </w:pPr>
+            <w:r>
+              <w:t xml:space="preserve">53/62</w:t>
+            </w:r>
+          </w:p>
+        </w:tc>
+        <w:tc>
+          <w:tcPr/>
+          <w:p>
+            <w:pPr>
+              <w:pStyle w:val="Compact"/>
+              <w:jc w:val="left"/>
+            </w:pPr>
+            <w:r>
+              <w:t xml:space="preserve">0</w:t>
+            </w:r>
+          </w:p>
+        </w:tc>
+        <w:tc>
+          <w:tcPr/>
+          <w:p>
+            <w:pPr>
+              <w:pStyle w:val="Compact"/>
+              <w:jc w:val="left"/>
+            </w:pPr>
+            <w:r>
+              <w:t xml:space="preserve">0</w:t>
+            </w:r>
+          </w:p>
+        </w:tc>
+      </w:tr>
+    </w:tbl>
+    <w:p>
+      <w:pPr>
+        <w:pStyle w:val="BodyText"/>
+      </w:pPr>
+      <w:r>
+        <w:rPr>
+          <w:bCs/>
+          <w:b/>
+        </w:rPr>
+        <w:t xml:space="preserve">Where the losses were:</w:t>
+      </w:r>
+      <w:r>
+        <w:t xml:space="preserve"> </w:t>
+      </w:r>
+      <w:r>
+        <w:t xml:space="preserve">every Add-Employee miss traced to the deterministic backbone —</w:t>
+      </w:r>
+      <w:r>
+        <w:t xml:space="preserve"> </w:t>
+      </w:r>
+      <w:r>
+        <w:t xml:space="preserve">either a missing</w:t>
+      </w:r>
+      <w:r>
+        <w:t xml:space="preserve"> </w:t>
+      </w:r>
+      <w:r>
+        <w:rPr>
+          <w:bCs/>
+          <w:b/>
+        </w:rPr>
+        <w:t xml:space="preserve">Knowledge-Base obligation</w:t>
+      </w:r>
+      <w:r>
+        <w:t xml:space="preserve"> </w:t>
+      </w:r>
+      <w:r>
+        <w:t xml:space="preserve">(Cycles 1 &amp; 3) or a</w:t>
+      </w:r>
+      <w:r>
+        <w:t xml:space="preserve"> </w:t>
+      </w:r>
+      <w:r>
+        <w:rPr>
+          <w:bCs/>
+          <w:b/>
+        </w:rPr>
+        <w:t xml:space="preserve">planner</w:t>
+      </w:r>
+      <w:r>
+        <w:t xml:space="preserve"> </w:t>
+      </w:r>
+      <w:r>
+        <w:t xml:space="preserve">that</w:t>
+      </w:r>
+      <w:r>
+        <w:t xml:space="preserve"> </w:t>
+      </w:r>
+      <w:r>
+        <w:t xml:space="preserve">collapsed per-field checks into one generic case (Cycle 2). None required a new engine or</w:t>
+      </w:r>
+      <w:r>
+        <w:t xml:space="preserve"> </w:t>
+      </w:r>
+      <w:r>
+        <w:t xml:space="preserve">architecture; all fixes live in the canonical</w:t>
+      </w:r>
+      <w:r>
+        <w:t xml:space="preserve"> </w:t>
+      </w:r>
+      <w:r>
+        <w:rPr>
+          <w:rStyle w:val="VerbatimChar"/>
+        </w:rPr>
+        <w:t xml:space="preserve">crud</w:t>
+      </w:r>
+      <w:r>
+        <w:t xml:space="preserve"> </w:t>
+      </w:r>
+      <w:r>
+        <w:t xml:space="preserve">KB category and the existing planner,</w:t>
+      </w:r>
+      <w:r>
+        <w:t xml:space="preserve"> </w:t>
+      </w:r>
+      <w:r>
+        <w:t xml:space="preserve">so they transfer to every CRUD requirement (Create Employee 88→100%, Edit Employee</w:t>
+      </w:r>
+      <w:r>
+        <w:t xml:space="preserve"> </w:t>
+      </w:r>
+      <w:r>
+        <w:t xml:space="preserve">77→86%, User Profile 65→70% on the sealed cross-requirement scorer — zero regressions).</w:t>
+      </w:r>
+    </w:p>
+    <w:p>
+      <w:pPr>
+        <w:pStyle w:val="BodyText"/>
+      </w:pPr>
+      <w:r>
+        <w:rPr>
+          <w:bCs/>
+          <w:b/>
+        </w:rPr>
+        <w:t xml:space="preserve">The 9 remaining gold rows are honest, documented gaps</w:t>
+      </w:r>
+      <w:r>
+        <w:t xml:space="preserve">, all Low/Medium</w:t>
+      </w:r>
+      <w:r>
+        <w:t xml:space="preserve"> </w:t>
+      </w:r>
+      <w:r>
+        <w:rPr>
+          <w:iCs/>
+          <w:i/>
+        </w:rPr>
+        <w:t xml:space="preserve">quality</w:t>
+      </w:r>
+      <w:r>
+        <w:rPr>
+          <w:iCs/>
+          <w:i/>
+        </w:rPr>
+        <w:t xml:space="preserve"> </w:t>
+      </w:r>
+      <w:r>
+        <w:rPr>
+          <w:iCs/>
+          <w:i/>
+        </w:rPr>
+        <w:t xml:space="preserve">attributes</w:t>
+      </w:r>
+      <w:r>
+        <w:t xml:space="preserve"> </w:t>
+      </w:r>
+      <w:r>
+        <w:t xml:space="preserve">a one-paragraph functional requirement does not imply: audit-log entry,</w:t>
+      </w:r>
+      <w:r>
+        <w:t xml:space="preserve"> </w:t>
+      </w:r>
+      <w:r>
+        <w:t xml:space="preserve">notification channel (toast/email), keyboard/a11y, mandatory-field marking, emoji handling,</w:t>
+      </w:r>
+      <w:r>
+        <w:t xml:space="preserve"> </w:t>
+      </w:r>
+      <w:r>
+        <w:t xml:space="preserve">unsaved-changes warning, photo-persistence, same-ID concurrency, and</w:t>
+      </w:r>
+      <w:r>
+        <w:t xml:space="preserve"> </w:t>
+      </w:r>
+      <w:r>
+        <w:t xml:space="preserve">“</w:t>
+      </w:r>
+      <w:r>
+        <w:t xml:space="preserve">errors are clear and</w:t>
+      </w:r>
+      <w:r>
+        <w:t xml:space="preserve"> </w:t>
+      </w:r>
+      <w:r>
+        <w:t xml:space="preserve">actionable</w:t>
+      </w:r>
+      <w:r>
+        <w:t xml:space="preserve">”</w:t>
+      </w:r>
+      <w:r>
+        <w:t xml:space="preserve">. Manufacturing keyword rules for these would be the non-scaling trap this</w:t>
+      </w:r>
+      <w:r>
+        <w:t xml:space="preserve"> </w:t>
+      </w:r>
+      <w:r>
+        <w:t xml:space="preserve">exercise exists to avoid — they are left visible in the worklist rather than gamed.</w:t>
+      </w:r>
+    </w:p>
     <w:bookmarkEnd w:id="34"/>
     <w:bookmarkEnd w:id="35"/>
+    <w:bookmarkEnd w:id="36"/>
     <w:sectPr/>
   </w:body>
 </w:document>

</xml_diff>